<commit_message>
Redesign terminal and phone setup PDFs (#71)
</commit_message>
<xml_diff>
--- a/docs/phone_installation.docx
+++ b/docs/phone_installation.docx
@@ -52,7 +52,7 @@
         <w:keepLines/>
       </w:pPr>
       <w:r>
-        <w:t xml:space="preserve">Tap Download ZmalaPhone.apk in your setup document. Alternatively, open </w:t>
+        <w:t xml:space="preserve">Scan the first QR in your setup document using the phone camera, or tap its download link. Alternatively, open </w:t>
       </w:r>
       <w:hyperlink r:id="rId9">
         <w:r>
@@ -92,7 +92,7 @@
         <w:keepLines/>
       </w:pPr>
       <w:r>
-        <w:t>Open ZmalaPhone. Tap Scan setup QR and point the camera at your code, or tap Open QR image and select a saved picture. Check the server address, then tap Connect.</w:t>
+        <w:t>Open ZmalaPhone. Tap Scan setup QR and point the camera at the second (account setup) code, or tap Open QR image and select a saved picture. Check the server address, then tap Connect.</w:t>
       </w:r>
     </w:p>
     <w:p>

</xml_diff>